<commit_message>
Put Discovery A-D edits and localized Word sources onto the locale hubs, keep images and texts always visible, and fix browser Back/Forward.
Co-authored-by: Cursor <cursoragent@cursor.com>
</commit_message>
<xml_diff>
--- a/az/discovery-articles/1.10 Metallurgiya.docx
+++ b/az/discovery-articles/1.10 Metallurgiya.docx
@@ -4,527 +4,350 @@
   <w:body>
     <w:p>
       <w:pPr>
-        <w:keepNext/>
-        <w:spacing w:before="280" w:after="120"/>
+        <w:pStyle w:val="Title"/>
+        <w:widowControl/>
       </w:pPr>
       <w:r>
-        <w:rPr>
-          <w:rFonts w:ascii="Calibri" w:hAnsi="Calibri" w:eastAsia="Calibri"/>
-          <w:b/>
-          <w:i w:val="0"/>
-          <w:color w:val="004E8C"/>
-          <w:sz w:val="44"/>
-        </w:rPr>
         <w:t>1.10 Metallurgiya</w:t>
       </w:r>
     </w:p>
     <w:p>
       <w:pPr>
-        <w:spacing w:after="80"/>
+        <w:keepNext/>
+        <w:widowControl/>
       </w:pPr>
       <w:r>
         <w:rPr>
-          <w:rFonts w:ascii="Calibri" w:hAnsi="Calibri" w:eastAsia="Calibri"/>
-          <w:b w:val="0"/>
-          <w:i/>
-          <w:color w:val="505050"/>
-          <w:sz w:val="22"/>
+          <w:sz w:val="20"/>
         </w:rPr>
-        <w:t>1. Sivilizasiyanın təməlləri</w:t>
-      </w:r>
-    </w:p>
-    <w:p>
-      <w:pPr>
-        <w:spacing w:after="200"/>
-      </w:pPr>
-      <w:r>
-        <w:rPr>
-          <w:rFonts w:ascii="Calibri" w:hAnsi="Calibri" w:eastAsia="Calibri"/>
-          <w:b w:val="0"/>
-          <w:i/>
-          <w:sz w:val="22"/>
-        </w:rPr>
-        <w:t>Dövr: e.ə. təxminən 5000-ci ildən başlayaraq (mis); e.ə. təxminən 3000-ci il (tunc); e.ə. təxminən 1200-cü ildən başlayaraq (bölgələr üzrə fərqlənən Dəmir dövrü) | Əsas mərkəzlər: Yaxın Şərq, Anadolu, Çin və Afrikadakı erkən mərkəzlər; sonralar bütün dünyada dəmir və polad ənənələri</w:t>
-      </w:r>
-    </w:p>
-    <w:p>
-      <w:pPr>
-        <w:spacing w:after="160" w:line="276" w:lineRule="auto"/>
-      </w:pPr>
-      <w:r>
-        <w:rPr>
-          <w:rFonts w:ascii="Calibri" w:hAnsi="Calibri" w:eastAsia="Calibri"/>
-          <w:b w:val="0"/>
-          <w:i w:val="0"/>
-          <w:sz w:val="22"/>
-        </w:rPr>
-        <w:t>Metallurgiya filizdən metal əldə etmək və onun xassələrini istilik, döymə və ərintilər vasitəsilə dəyişdirmək sənətidir. Mis, tunc, dəmir və poladın mənimsənilməsi daha möhkəm alətlərin, nəqliyyat vasitələrinin, tikililərin və maşınların hazırlanmasına yol açdı.</w:t>
+        <w:t>1 Sivilizasiyanın təməlləri</w:t>
       </w:r>
     </w:p>
     <w:p>
       <w:pPr>
         <w:keepNext/>
-        <w:spacing w:before="240" w:after="120"/>
+        <w:widowControl/>
       </w:pPr>
       <w:r>
         <w:rPr>
-          <w:rFonts w:ascii="Calibri" w:hAnsi="Calibri" w:eastAsia="Calibri"/>
-          <w:b/>
-          <w:i w:val="0"/>
-          <w:color w:val="004E8C"/>
-          <w:sz w:val="28"/>
+          <w:sz w:val="20"/>
         </w:rPr>
-        <w:t>Əsas faktlar</w:t>
+        <w:t>Dövr: təxminən e.ə. 5000-ci ildən mis; e.ə. 3000-ci ildən tunc; təxminən e.ə. 1200-cü ildən bölgələr üzrə dəmir dövrləri | Əsas mərkəzlər: Yaxın Şərq, Anadolu, Çin və Afrika; sonralar dünyanın müxtəlif dəmir və polad istehsalı ənənələri</w:t>
+      </w:r>
+    </w:p>
+    <w:p>
+      <w:pPr>
+        <w:widowControl/>
+      </w:pPr>
+      <w:r>
+        <w:t>Metallurgiya filizdən metal almaq, istilik və alətlər vasitəsilə ona forma vermək sənətidir. Misdən və tuncdan dəmirə və polada qədər uzanan bu inkişaf torpaqdan çıxarılan xammalı möhkəm tiyələrə, xışlara, mismarlara və maşınlara çevirdi.</w:t>
+      </w:r>
+    </w:p>
+    <w:p>
+      <w:pPr>
+        <w:pStyle w:val="Heading1"/>
+        <w:widowControl/>
+      </w:pPr>
+      <w:r>
+        <w:t>Əsas məlumatlar</w:t>
       </w:r>
     </w:p>
     <w:p>
       <w:pPr>
         <w:pStyle w:val="ListBullet"/>
+        <w:widowControl/>
       </w:pPr>
       <w:r>
-        <w:rPr>
-          <w:rFonts w:ascii="Calibri" w:hAnsi="Calibri" w:eastAsia="Calibri"/>
-          <w:b w:val="0"/>
-          <w:i w:val="0"/>
-          <w:sz w:val="22"/>
-        </w:rPr>
-        <w:t>Misin emalı e.ə. V minillikdə bir neçə bölgədə mövcud idi</w:t>
+        <w:t>Bir neçə bölgədə e.ə. V minilliyədək mis emalına rast gəlinir.</w:t>
       </w:r>
     </w:p>
     <w:p>
       <w:pPr>
         <w:pStyle w:val="ListBullet"/>
+        <w:widowControl/>
       </w:pPr>
       <w:r>
-        <w:rPr>
-          <w:rFonts w:ascii="Calibri" w:hAnsi="Calibri" w:eastAsia="Calibri"/>
-          <w:b w:val="0"/>
-          <w:i w:val="0"/>
-          <w:sz w:val="22"/>
-        </w:rPr>
-        <w:t>Misə qalay və ya arsen əlavə etməklə alınan tunc daha möhkəm alət və silahların hazırlanmasına imkan verdi</w:t>
+        <w:t>Misə qalay və ya arsen qatılaraq alınan tunc daha sərt alət və silahlar hazırlamağa imkan verdi.</w:t>
       </w:r>
     </w:p>
     <w:p>
       <w:pPr>
         <w:pStyle w:val="ListBullet"/>
+        <w:widowControl/>
       </w:pPr>
       <w:r>
-        <w:rPr>
-          <w:rFonts w:ascii="Calibri" w:hAnsi="Calibri" w:eastAsia="Calibri"/>
-          <w:b w:val="0"/>
-          <w:i w:val="0"/>
-          <w:sz w:val="22"/>
-        </w:rPr>
-        <w:t>Dəmir əritmə texnologiyası e.ə. təxminən 1200-cü ildən sonra geniş yayıldı, lakin tarixlər bölgələrə görə fərqlənir</w:t>
+        <w:t>Dəmirin filizdən alınması təxminən e.ə. 1200-cü ildən sonra geniş yayıldı; tarixlər bölgələrə görə fərqlənir.</w:t>
       </w:r>
     </w:p>
     <w:p>
       <w:pPr>
         <w:pStyle w:val="ListBullet"/>
+        <w:widowControl/>
       </w:pPr>
       <w:r>
-        <w:rPr>
-          <w:rFonts w:ascii="Calibri" w:hAnsi="Calibri" w:eastAsia="Calibri"/>
-          <w:b w:val="0"/>
-          <w:i w:val="0"/>
-          <w:sz w:val="22"/>
-        </w:rPr>
-        <w:t>Polad möhkəmlik və elastiklik qazanması üçün tərkibinə məqsədli şəkildə karbon qatılan dəmirdir</w:t>
+        <w:t>Polad möhkəmlik və elastiklik əldə etmək üçün tərkibinə məqsədli şəkildə karbon qatılan dəmirdir.</w:t>
       </w:r>
     </w:p>
     <w:p>
       <w:pPr>
         <w:pStyle w:val="ListBullet"/>
+        <w:widowControl/>
       </w:pPr>
       <w:r>
-        <w:rPr>
-          <w:rFonts w:ascii="Calibri" w:hAnsi="Calibri" w:eastAsia="Calibri"/>
-          <w:b w:val="0"/>
-          <w:i w:val="0"/>
-          <w:sz w:val="22"/>
-        </w:rPr>
-        <w:t>Sobalar, körüklər və ağac kömürü daha yüksək temperatur əldə etməyə imkan verdi</w:t>
+        <w:t>Sobalar, körüklər və ağac kömürü daha yüksək temperatur əldə etməyə imkan verdi.</w:t>
       </w:r>
     </w:p>
     <w:p>
       <w:pPr>
-        <w:keepNext/>
-        <w:spacing w:before="240" w:after="120"/>
+        <w:pStyle w:val="Heading1"/>
+        <w:widowControl/>
       </w:pPr>
       <w:r>
-        <w:rPr>
-          <w:rFonts w:ascii="Calibri" w:hAnsi="Calibri" w:eastAsia="Calibri"/>
-          <w:b/>
-          <w:i w:val="0"/>
-          <w:color w:val="004E8C"/>
-          <w:sz w:val="28"/>
-        </w:rPr>
-        <w:t>Bu nədir və necə işləyir?</w:t>
+        <w:t>Bu nədir</w:t>
       </w:r>
     </w:p>
     <w:p>
       <w:pPr>
-        <w:spacing w:after="160" w:line="276" w:lineRule="auto"/>
+        <w:widowControl/>
       </w:pPr>
       <w:r>
-        <w:rPr>
-          <w:rFonts w:ascii="Calibri" w:hAnsi="Calibri" w:eastAsia="Calibri"/>
-          <w:b w:val="0"/>
-          <w:i w:val="0"/>
-          <w:sz w:val="22"/>
-        </w:rPr>
-        <w:t>Metallurgiya filizdən metalın alınması və ondan faydalı əşyaların hazırlanmasıdır. Filiz qızdırılır, metal başqa maddələrdən ayrılır, sonra qəlibə tökülür, döyülür, başqa metallarla qarışdırılaraq ərinti hazırlanır və ya möhkəmləndirilir. Mis nisbətən aşağı temperaturda əridiyi üçün ilk işlənən metallardan biri oldu. Misin qalay və ya arsenlə ərintisi olan tunc daha möhkəmdir və iti kənarını daha yaxşı saxlayır. Dəmir və polad daha yüksək temperaturlu sobalar tələb edir, lakin onların xammalı təbiətdə daha geniş yayılıb. Beləliklə, filiz bıçağa, mismara və kotana çevrilir.</w:t>
+        <w:t>Metallurgiya süxurdan metal çıxarmaq və ondan faydalı əşyalar hazırlamaqdır. Filiz qızdırılaraq metal ayrılır, sonra tökülür, döyülür, başqa maddələrlə ərinti halına gətirilir və ya bərkidilir. Mis nisbətən aşağı temperaturda əridiyi üçün çox vaxt ilk istifadə olunan metal idi. Misə qalay və ya arsen qatılaraq alınan tunc daha sərtdir və iti kənar almağa imkan verir. Dəmir və polad üçün daha isti sobalar tələb olunur, əvəzində xammalları daha geniş yayılıb. Beləcə, sərt süxur bıçağa, mismara və ya xışın kəsici hissəsinə çevrilir.</w:t>
       </w:r>
     </w:p>
     <w:p>
       <w:pPr>
-        <w:keepNext/>
-        <w:spacing w:before="240" w:after="120"/>
+        <w:pStyle w:val="Heading1"/>
+        <w:widowControl/>
       </w:pPr>
       <w:r>
-        <w:rPr>
-          <w:rFonts w:ascii="Calibri" w:hAnsi="Calibri" w:eastAsia="Calibri"/>
-          <w:b/>
-          <w:i w:val="0"/>
-          <w:color w:val="004E8C"/>
-          <w:sz w:val="28"/>
-        </w:rPr>
-        <w:t>Kim kəşf və ya ixtira edib?</w:t>
+        <w:t>Kim kəşf edib və ya yaradıb</w:t>
       </w:r>
     </w:p>
     <w:p>
       <w:pPr>
-        <w:spacing w:after="160" w:line="276" w:lineRule="auto"/>
+        <w:widowControl/>
       </w:pPr>
       <w:r>
-        <w:rPr>
-          <w:rFonts w:ascii="Calibri" w:hAnsi="Calibri" w:eastAsia="Calibri"/>
-          <w:b w:val="0"/>
-          <w:i w:val="0"/>
-          <w:sz w:val="22"/>
-        </w:rPr>
-        <w:t>Metallurgiyanın vahid bir ixtiraçısı yoxdur. Misin erkən emalı Yaxın Şərqdə, Anadoluda, Balkanlarda, sonralar isə Çində və Afrikanın bəzi bölgələrində meydana çıxdı. Tunc istehsalının bir neçə erkən mərkəzi vardı; qalay ticarəti uzaq icmaları bir-birinə bağladı. Dəmirçilik bilik və bacarıqların ustadan şagirdə ötürülməsi yolu ilə yayıldı. Arxeoloqlar şlak, əridici potalar və hazır bıçaqlar aşkar etsələr də, ilk dəmirçilərin adları unudulub. Yayılan əsas bilik odun hansı temperatura çatması, hansı filizin metal verməsi və metalın çatlamadan necə döyülməsi idi.</w:t>
+        <w:t>Metallurgiyanın tək bir ixtiraçısı yoxdur. Erkən mis emalı Yaxın Şərqdə, Anadoluda, Balkanlarda, daha sonra Çində və Afrikanın bəzi bölgələrində inkişaf edib. Tunc istehsalının bir neçə erkən mərkəzi vardı; qalay ticarəti uzaq icmaları birləşdirirdi. Dəmirçilik ustadan şagirdə ötürülərək yayılırdı. Arxeoloqlar şlak, əridici qab və hazır tiyələr tapırlar, lakin ilk dəmirçilərin adları unudulub. Yayılan praktik bilik idi: od nə qədər isti olmalıdır, hansı süxurdan metal almaq sərfəlidir, metal çatlamadan necə döyülməlidir?</w:t>
       </w:r>
     </w:p>
     <w:p>
       <w:pPr>
-        <w:keepNext/>
-        <w:spacing w:before="240" w:after="120"/>
+        <w:pStyle w:val="Heading1"/>
+        <w:widowControl/>
       </w:pPr>
       <w:r>
-        <w:rPr>
-          <w:rFonts w:ascii="Calibri" w:hAnsi="Calibri" w:eastAsia="Calibri"/>
-          <w:b/>
-          <w:i w:val="0"/>
-          <w:color w:val="004E8C"/>
-          <w:sz w:val="28"/>
-        </w:rPr>
-        <w:t>Nə vaxt və necə yaranıb?</w:t>
+        <w:t>Nə vaxt və necə yaranıb</w:t>
       </w:r>
     </w:p>
     <w:p>
       <w:pPr>
-        <w:spacing w:after="160" w:line="276" w:lineRule="auto"/>
+        <w:widowControl/>
       </w:pPr>
       <w:r>
-        <w:rPr>
-          <w:rFonts w:ascii="Calibri" w:hAnsi="Calibri" w:eastAsia="Calibri"/>
-          <w:b w:val="0"/>
-          <w:i w:val="0"/>
-          <w:sz w:val="22"/>
-        </w:rPr>
-        <w:t>E.ə. təxminən 5000-ci ildən başlayaraq icmalar təbii mis parçalarını formalaşdırır və sadə filizləri əritməyi öyrənirdilər. Cənub-Qərbi Asiyanın bəzi hissələrində Tunc dövrü e.ə. III minillikdə başladı; başqa bölgələrdə oxşar inkişaf fərqli vaxtlarda baş verdi. Dəmir texnologiyaları bir çox bölgədə e.ə. təxminən 1200-cü ildən sonra sürətlə yayıldı, hərçənd daha erkən təcrübələr də mövcud idi. İnkişaf yumşaq bəzək əşyalarından kotanlara, qılınclara, mismarlara, daha sonra isə relslərə və mühərriklərə doğru getdi. Hər mərhələ yanacaq, gil soba və od içindəki metalın rənginə baxaraq temperaturu müəyyənləşdirə bilən ustalar tələb edirdi.</w:t>
+        <w:t>Təxminən e.ə. 5000-ci ildə icmalar təbii halda tapılan misə forma verir, sadə filizlərdən metal almağı öyrənirdilər. Cənub-Qərbi Asiyanın bəzi bölgələrində tunc dövrü təxminən e.ə. III minillikdə başladı; başqa yerlərdə oxşar inkişaf fərqli vaxtlarda baş verdi. Daha erkən sınaqlar olsa da, bir çox bölgədə dəmir texnologiyaları təxminən e.ə. 1200-cü ildən sonra genişləndi. Yumşaq bəzək əşyalarından xış tiyələrinə, qılınclara və mismarlara, daha sonra relslərə və mühərriklərə keçildi. Hər mərhələ yanacaq, gil soba və metalın oddakı rəngini qiymətləndirən ustalar tələb edirdi.</w:t>
       </w:r>
     </w:p>
     <w:p>
       <w:pPr>
-        <w:keepNext/>
-        <w:spacing w:before="240" w:after="120"/>
+        <w:pStyle w:val="Heading1"/>
+        <w:widowControl/>
       </w:pPr>
       <w:r>
-        <w:rPr>
-          <w:rFonts w:ascii="Calibri" w:hAnsi="Calibri" w:eastAsia="Calibri"/>
-          <w:b/>
-          <w:i w:val="0"/>
-          <w:color w:val="004E8C"/>
-          <w:sz w:val="28"/>
-        </w:rPr>
-        <w:t>Elmi əhəmiyyəti</w:t>
+        <w:t>Elm üçün əhəmiyyəti</w:t>
       </w:r>
     </w:p>
     <w:p>
       <w:pPr>
-        <w:spacing w:after="160" w:line="276" w:lineRule="auto"/>
+        <w:widowControl/>
       </w:pPr>
       <w:r>
-        <w:rPr>
-          <w:rFonts w:ascii="Calibri" w:hAnsi="Calibri" w:eastAsia="Calibri"/>
-          <w:b w:val="0"/>
-          <w:i w:val="0"/>
-          <w:sz w:val="22"/>
-        </w:rPr>
-        <w:t>Metallurgiya kimyanın və istiliyə nəzarətin praktik tətbiqidir. Əritmə zamanı filizdəki oksigen ayrılır və metal sərbəstləşir. Ərintinin hazırlanması materialın sərtliyini dəyişdirir, sürətlə soyutma və sonrakı istilik emalı isə poladın daxili quruluşunu yenidən formalaşdırır. Ağac kömürü, sonralar isə daş kömür həm istilik, həm də karbon mənbəyi oldu. Dəmirçilər müasir termometr olmadan, metalın közərmə rənginə və çəkic altında davranışına əsasən temperaturu müəyyənləşdirirdilər. Müasir materialşünaslıq dəmirçi ocağında toplanmış bu bilikləri elmi şəkildə izah edir.</w:t>
+        <w:t>Metallurgiya kimyanın və istiliyin idarə olunmasının praktik tətbiqidir. Filizdən metal alma zamanı oksigenin ayrılması, ərinti hazırlayarkən isə sərtliyin dəyişməsi mühüm rol oynayır. Tablandırma — qızmış metalın sürətlə soyudulması — və tabəksiltmə — onun yenidən daha mülayim qızdırılması — poladın daxili quruluşunu dəyişir. Ağac kömürü, sonralar daş kömür karbon və istilik verirdi. Ustalar müasir termometrlər olmadan metalın közərmə rənginə və çəkic altında davranışına əsaslanırdılar. Müasir materialşünaslıq dəmirçi emalatxanasında qazanılan bilikləri dəqiq izah edir.</w:t>
       </w:r>
     </w:p>
     <w:p>
       <w:pPr>
-        <w:keepNext/>
-        <w:spacing w:before="240" w:after="120"/>
+        <w:pStyle w:val="Heading1"/>
+        <w:widowControl/>
       </w:pPr>
       <w:r>
-        <w:rPr>
-          <w:rFonts w:ascii="Calibri" w:hAnsi="Calibri" w:eastAsia="Calibri"/>
-          <w:b/>
-          <w:i w:val="0"/>
-          <w:color w:val="004E8C"/>
-          <w:sz w:val="28"/>
-        </w:rPr>
         <w:t>Sonrakı inkişafa təsiri</w:t>
       </w:r>
     </w:p>
     <w:p>
       <w:pPr>
-        <w:spacing w:after="160" w:line="276" w:lineRule="auto"/>
+        <w:widowControl/>
       </w:pPr>
       <w:r>
-        <w:rPr>
-          <w:rFonts w:ascii="Calibri" w:hAnsi="Calibri" w:eastAsia="Calibri"/>
-          <w:b w:val="0"/>
-          <w:i w:val="0"/>
-          <w:sz w:val="22"/>
-        </w:rPr>
-        <w:t>Möhkəm metal alətlər əkinçiliyi, dülgərliyi və daş hörgüsünü sürətləndirdi. Silah və zirehlər müharibənin və dövlətlərin quruluşunu dəyişdirdi. Dəmir mismarlar, menteşələr və tirlər tikintiyə yeni imkanlar verdi. Çox sonralar polad relslər, gəmi lövhələri və maşın çərçivələri sənaye nəqliyyatını və fabrikləri mümkün etdi. Domna sobası, pota poladı və Bessemer tipli proseslər istehsal həcmini dəfələrlə artırdı. Sonrakı bütün maşın dövrləri filiz yataqlarının yaxınlığında aparılan ilk od təcrübələrindən başlayan ərintilərə əsaslanır.</w:t>
+        <w:t>Möhkəm metal alətlər əkinçiliyi, dülgərliyi və daş hörgüsünü sürətləndirdi. Silah və zirehlər müharibəni və dövlətləri dəyişdi. Dəmir mismarlar, cəftə və menteşələr, tirlər tikintiyə yeni imkanlar verdi. Xeyli sonra polad relslər, gəmi lövhələri və maşın gövdələri sənaye nəqliyyatını və fabrikləri mümkün etdi. Domna sobaları, puta poladı və Bessemer tipli üsullar istehsalı artırdı. Sonrakı maşın əsrləri də başlanğıcını filiz yataqları yanındakı od təcrübələrindən alan ərintilərə söykənir.</w:t>
       </w:r>
     </w:p>
     <w:p>
       <w:pPr>
-        <w:keepNext/>
-        <w:spacing w:before="240" w:after="120"/>
+        <w:pStyle w:val="Heading1"/>
+        <w:widowControl/>
       </w:pPr>
       <w:r>
-        <w:rPr>
-          <w:rFonts w:ascii="Calibri" w:hAnsi="Calibri" w:eastAsia="Calibri"/>
-          <w:b/>
-          <w:i w:val="0"/>
-          <w:color w:val="004E8C"/>
-          <w:sz w:val="28"/>
-        </w:rPr>
-        <w:t>İnsan həyatını necə dəyişdi?</w:t>
+        <w:t>İnsan həyatını necə dəyişib</w:t>
       </w:r>
     </w:p>
     <w:p>
       <w:pPr>
-        <w:spacing w:after="160" w:line="276" w:lineRule="auto"/>
+        <w:widowControl/>
       </w:pPr>
       <w:r>
-        <w:rPr>
-          <w:rFonts w:ascii="Calibri" w:hAnsi="Calibri" w:eastAsia="Calibri"/>
-          <w:b w:val="0"/>
-          <w:i w:val="0"/>
-          <w:sz w:val="22"/>
-        </w:rPr>
-        <w:t>Metal alətlər torpağın təmizlənməsinə və sığınacaq tikintisinə sərf olunan əməyi azaltdı. Mis, qalay və dəmir ticarəti uzaq bölgələri mübadilə və münaqişə şəbəkələrində birləşdirdi. Gündəlik həyata ağac və daşdan daha uzunömürlü bıçaqlar, qazanlar, iynələr, sikkələr və kotanlar daxil oldu. Metallurgiya həmçinin zəhərli tüstü, ağac kömürü üçün meşələrin qırılması və təhlükəli mədən əməyini gətirdi. Bununla belə, körpülər, cərrahi alətlər və göydələnlərin metal karkasları bu gün də eyni əsaslara — istiliyə, filizə və bacarıqlı insan əlinə söykənir.</w:t>
+        <w:t>Metal alətlər torpaq təmizləmək və sığınacaq tikmək zəhmətini azaltdı. Mis, qalay və dəmir ticarəti uzaq bölgələri həm mübadilə, həm də münaqişə əlaqələrinə bağladı. Ağac və daşdan daha davamlı bıçaqlar, qablar, iynələr, sikkələr və xışlar gündəlik həyata daxil oldu. Metallurgiya tüstü, ağac kömürü üçün meşələrin qırılması və təhlükəli mədən əməyi də gətirdi. Körpülər, cərrahiyyə alətləri və göydələnlərin karkasları isə hələ də istiliyin, filizin və bacarıqlı əməyin birləşməsindən asılıdır.</w:t>
       </w:r>
     </w:p>
     <w:p>
       <w:pPr>
-        <w:keepNext/>
-        <w:spacing w:before="240" w:after="120"/>
+        <w:pStyle w:val="Heading1"/>
+        <w:widowControl/>
       </w:pPr>
       <w:r>
-        <w:rPr>
-          <w:rFonts w:ascii="Calibri" w:hAnsi="Calibri" w:eastAsia="Calibri"/>
-          <w:b/>
-          <w:i w:val="0"/>
-          <w:color w:val="004E8C"/>
-          <w:sz w:val="28"/>
-        </w:rPr>
         <w:t>Mənbələr və istinadlar</w:t>
       </w:r>
     </w:p>
     <w:p>
       <w:pPr>
-        <w:keepNext/>
-        <w:spacing w:before="240" w:after="120"/>
+        <w:pStyle w:val="Heading2"/>
+        <w:widowControl/>
       </w:pPr>
       <w:r>
         <w:rPr>
-          <w:rFonts w:ascii="Calibri" w:hAnsi="Calibri" w:eastAsia="Calibri"/>
-          <w:b/>
-          <w:i w:val="0"/>
-          <w:color w:val="004E8C"/>
-          <w:sz w:val="24"/>
+          <w:sz w:val="20"/>
         </w:rPr>
-        <w:t>A. Kitablar və əsas elmi əsərlər</w:t>
+        <w:t>A Kitablar və əsas elmi əsərlər</w:t>
       </w:r>
     </w:p>
     <w:p>
       <w:pPr>
-        <w:spacing w:after="80"/>
-        <w:ind w:left="360"/>
+        <w:widowControl/>
       </w:pPr>
       <w:r>
         <w:rPr>
-          <w:rFonts w:ascii="Calibri" w:hAnsi="Calibri" w:eastAsia="Calibri"/>
-          <w:b w:val="0"/>
-          <w:i w:val="0"/>
-          <w:sz w:val="22"/>
+          <w:sz w:val="20"/>
         </w:rPr>
         <w:t>1. Tylecote, R. F. A History of Metallurgy. 2nd ed. London: Institute of Materials, 1992.</w:t>
       </w:r>
     </w:p>
     <w:p>
       <w:pPr>
-        <w:keepNext/>
-        <w:spacing w:before="240" w:after="120"/>
+        <w:pStyle w:val="Heading2"/>
+        <w:widowControl/>
       </w:pPr>
       <w:r>
         <w:rPr>
-          <w:rFonts w:ascii="Calibri" w:hAnsi="Calibri" w:eastAsia="Calibri"/>
-          <w:b/>
-          <w:i w:val="0"/>
-          <w:color w:val="004E8C"/>
-          <w:sz w:val="24"/>
+          <w:sz w:val="20"/>
         </w:rPr>
-        <w:t>C. Təşkilatların materialları və ensiklopedik mənbələr</w:t>
+        <w:t>C Qurumların materialları və ensiklopedik mənbələr</w:t>
       </w:r>
     </w:p>
     <w:p>
       <w:pPr>
-        <w:spacing w:after="80"/>
-        <w:ind w:left="360"/>
+        <w:widowControl/>
       </w:pPr>
       <w:r>
         <w:rPr>
-          <w:rFonts w:ascii="Calibri" w:hAnsi="Calibri" w:eastAsia="Calibri"/>
-          <w:b w:val="0"/>
-          <w:i w:val="0"/>
-          <w:sz w:val="22"/>
+          <w:sz w:val="20"/>
         </w:rPr>
-        <w:t>1. Encyclopaedia Britannica. “Metallurgy” (“Metallurgiya”).</w:t>
-      </w:r>
-      <w:r>
-        <w:rPr>
-          <w:rFonts w:ascii="Calibri" w:hAnsi="Calibri" w:eastAsia="Calibri"/>
-          <w:b w:val="0"/>
-          <w:i w:val="0"/>
-          <w:sz w:val="22"/>
-        </w:rPr>
-        <w:t xml:space="preserve"> </w:t>
+        <w:t xml:space="preserve">1. Encyclopaedia Britannica. 'Metallurgy.' </w:t>
       </w:r>
       <w:hyperlink r:id="rId9">
         <w:r>
           <w:rPr>
-            <w:rFonts w:ascii="Calibri" w:hAnsi="Calibri" w:eastAsia="Calibri"/>
-            <w:b w:val="0"/>
-            <w:i w:val="0"/>
-            <w:sz w:val="22"/>
-            <w:color w:val="0563C1"/>
-            <w:u w:val="single"/>
+            <w:sz w:val="20"/>
           </w:rPr>
           <w:t>https://www.britannica.com/technology/metallurgy</w:t>
         </w:r>
       </w:hyperlink>
+      <w:r>
+        <w:rPr>
+          <w:sz w:val="20"/>
+        </w:rPr>
+      </w:r>
     </w:p>
     <w:p>
       <w:pPr>
-        <w:spacing w:after="80"/>
-        <w:ind w:left="360"/>
+        <w:widowControl/>
       </w:pPr>
       <w:r>
         <w:rPr>
-          <w:rFonts w:ascii="Calibri" w:hAnsi="Calibri" w:eastAsia="Calibri"/>
-          <w:b w:val="0"/>
-          <w:i w:val="0"/>
-          <w:sz w:val="22"/>
+          <w:sz w:val="20"/>
         </w:rPr>
-        <w:t>2. Encyclopaedia Britannica. “Bronze Age” (“Tunc dövrü”).</w:t>
-      </w:r>
-      <w:r>
-        <w:rPr>
-          <w:rFonts w:ascii="Calibri" w:hAnsi="Calibri" w:eastAsia="Calibri"/>
-          <w:b w:val="0"/>
-          <w:i w:val="0"/>
-          <w:sz w:val="22"/>
-        </w:rPr>
-        <w:t xml:space="preserve"> </w:t>
+        <w:t xml:space="preserve">2. Encyclopaedia Britannica. 'Bronze Age.' </w:t>
       </w:r>
       <w:hyperlink r:id="rId10">
         <w:r>
           <w:rPr>
-            <w:rFonts w:ascii="Calibri" w:hAnsi="Calibri" w:eastAsia="Calibri"/>
-            <w:b w:val="0"/>
-            <w:i w:val="0"/>
-            <w:sz w:val="22"/>
-            <w:color w:val="0563C1"/>
-            <w:u w:val="single"/>
+            <w:sz w:val="20"/>
           </w:rPr>
           <w:t>https://www.britannica.com/event/Bronze-Age</w:t>
         </w:r>
       </w:hyperlink>
-    </w:p>
-    <w:p>
-      <w:pPr>
-        <w:keepNext/>
-        <w:spacing w:before="240" w:after="120"/>
-      </w:pPr>
       <w:r>
         <w:rPr>
-          <w:rFonts w:ascii="Calibri" w:hAnsi="Calibri" w:eastAsia="Calibri"/>
-          <w:b/>
-          <w:i w:val="0"/>
-          <w:color w:val="004E8C"/>
-          <w:sz w:val="24"/>
+          <w:sz w:val="20"/>
         </w:rPr>
-        <w:t>J. Mətbuat, populyar elmi və ümumi məlumat mənbələri</w:t>
       </w:r>
     </w:p>
     <w:p>
       <w:pPr>
-        <w:spacing w:after="80"/>
-        <w:ind w:left="360"/>
+        <w:pStyle w:val="Heading2"/>
+        <w:widowControl/>
       </w:pPr>
       <w:r>
         <w:rPr>
-          <w:rFonts w:ascii="Calibri" w:hAnsi="Calibri" w:eastAsia="Calibri"/>
-          <w:b w:val="0"/>
-          <w:i w:val="0"/>
-          <w:sz w:val="22"/>
+          <w:sz w:val="20"/>
         </w:rPr>
-        <w:t>1. Smithsonian Magazine. “The Secret History of Steel” (“Poladın gizli tarixi”).</w:t>
+        <w:t>J Mətbuat elmi kütləvi nəşrlər və ümumi mənbələr</w:t>
       </w:r>
+    </w:p>
+    <w:p>
+      <w:pPr>
+        <w:widowControl/>
+      </w:pPr>
       <w:r>
         <w:rPr>
-          <w:rFonts w:ascii="Calibri" w:hAnsi="Calibri" w:eastAsia="Calibri"/>
-          <w:b w:val="0"/>
-          <w:i w:val="0"/>
-          <w:sz w:val="22"/>
+          <w:sz w:val="20"/>
         </w:rPr>
-        <w:t xml:space="preserve"> </w:t>
+        <w:t xml:space="preserve">1. Smithsonian Magazine. 'The Secret History of Steel.' </w:t>
       </w:r>
       <w:hyperlink r:id="rId11">
         <w:r>
           <w:rPr>
-            <w:rFonts w:ascii="Calibri" w:hAnsi="Calibri" w:eastAsia="Calibri"/>
-            <w:b w:val="0"/>
-            <w:i w:val="0"/>
-            <w:sz w:val="22"/>
-            <w:color w:val="0563C1"/>
-            <w:u w:val="single"/>
+            <w:sz w:val="20"/>
           </w:rPr>
           <w:t>https://www.smithsonianmag.com/history/the-secret-history-of-steel-180979013/</w:t>
         </w:r>
       </w:hyperlink>
+      <w:r>
+        <w:rPr>
+          <w:sz w:val="20"/>
+        </w:rPr>
+      </w:r>
     </w:p>
     <w:sectPr>
-      <w:pgSz w:w="12240" w:h="15840"/>
-      <w:pgMar w:top="1296" w:right="1440" w:bottom="1296" w:left="1440" w:header="720" w:footer="720" w:gutter="0"/>
+      <w:footerReference w:type="default" r:id="rId12"/>
+      <w:pgSz w:w="11906" w:h="16838"/>
+      <w:pgMar w:top="1020" w:right="1134" w:bottom="1020" w:left="1134" w:header="720" w:footer="720" w:gutter="0"/>
       <w:cols w:space="720"/>
       <w:docGrid w:linePitch="360"/>
     </w:sectPr>
   </w:body>
 </w:document>
+</file>
+
+<file path=word/footer1.xml><?xml version="1.0" encoding="utf-8"?>
+<w:ftr xmlns:m="http://schemas.openxmlformats.org/officeDocument/2006/math" xmlns:mc="http://schemas.openxmlformats.org/markup-compatibility/2006" xmlns:mo="http://schemas.microsoft.com/office/mac/office/2008/main" xmlns:mv="urn:schemas-microsoft-com:mac:vml" xmlns:o="urn:schemas-microsoft-com:office:office" xmlns:r="http://schemas.openxmlformats.org/officeDocument/2006/relationships" xmlns:v="urn:schemas-microsoft-com:vml" xmlns:w10="urn:schemas-microsoft-com:office:word" xmlns:w14="http://schemas.microsoft.com/office/word/2010/wordml" xmlns:w="http://schemas.openxmlformats.org/wordprocessingml/2006/main" xmlns:wne="http://schemas.microsoft.com/office/word/2006/wordml" xmlns:wp14="http://schemas.microsoft.com/office/word/2010/wordprocessingDrawing" xmlns:wp="http://schemas.openxmlformats.org/drawingml/2006/wordprocessingDrawing" xmlns:wpc="http://schemas.microsoft.com/office/word/2010/wordprocessingCanvas" xmlns:wpg="http://schemas.microsoft.com/office/word/2010/wordprocessingGroup" xmlns:wpi="http://schemas.microsoft.com/office/word/2010/wordprocessingInk" xmlns:wps="http://schemas.microsoft.com/office/word/2010/wordprocessingShape" mc:Ignorable="w14 wp14">
+  <w:p>
+    <w:pPr>
+      <w:pStyle w:val="Footer"/>
+      <w:jc w:val="right"/>
+    </w:pPr>
+    <w:fldSimple w:instr="PAGE"/>
+  </w:p>
+</w:ftr>
 </file>
 
 <file path=word/numbering.xml><?xml version="1.0" encoding="utf-8"?>
@@ -735,7 +558,7 @@
   <w:docDefaults>
     <w:rPrDefault>
       <w:rPr>
-        <w:rFonts w:asciiTheme="minorHAnsi" w:eastAsiaTheme="minorEastAsia" w:hAnsiTheme="minorHAnsi" w:cstheme="minorBidi"/>
+        <w:rFonts/>
         <w:sz w:val="22"/>
         <w:szCs w:val="22"/>
         <w:lang w:val="en-US" w:eastAsia="en-US" w:bidi="ar-SA"/>
@@ -890,6 +713,15 @@
     <w:name w:val="Normal"/>
     <w:qFormat/>
     <w:rsid w:val="00FC693F"/>
+    <w:pPr>
+      <w:spacing w:after="120" w:line="259" w:lineRule="auto"/>
+    </w:pPr>
+    <w:rPr>
+      <w:rFonts w:ascii="Times New Roman" w:hAnsi="Times New Roman"/>
+      <w:color w:val="000000"/>
+      <w:sz w:val="24"/>
+      <w:lang w:val="az-Latn-AZ"/>
+    </w:rPr>
   </w:style>
   <w:style w:type="paragraph" w:styleId="Header">
     <w:name w:val="header"/>
@@ -946,16 +778,17 @@
     <w:pPr>
       <w:keepNext/>
       <w:keepLines/>
-      <w:spacing w:before="480" w:after="0"/>
+      <w:spacing w:before="480" w:after="120" w:line="259" w:lineRule="auto"/>
       <w:outlineLvl w:val="0"/>
     </w:pPr>
     <w:rPr>
-      <w:rFonts w:asciiTheme="majorHAnsi" w:eastAsiaTheme="majorEastAsia" w:hAnsiTheme="majorHAnsi" w:cstheme="majorBidi"/>
+      <w:rFonts w:ascii="Times New Roman" w:hAnsi="Times New Roman"/>
       <w:b/>
       <w:bCs/>
-      <w:color w:val="365F91" w:themeColor="accent1" w:themeShade="BF"/>
-      <w:sz w:val="28"/>
+      <w:color w:val="000000"/>
+      <w:sz w:val="26"/>
       <w:szCs w:val="28"/>
+      <w:lang w:val="az-Latn-AZ"/>
     </w:rPr>
   </w:style>
   <w:style w:type="paragraph" w:styleId="Heading2">
@@ -970,16 +803,17 @@
     <w:pPr>
       <w:keepNext/>
       <w:keepLines/>
-      <w:spacing w:before="200" w:after="0"/>
+      <w:spacing w:before="200" w:after="120" w:line="259" w:lineRule="auto"/>
       <w:outlineLvl w:val="1"/>
     </w:pPr>
     <w:rPr>
-      <w:rFonts w:asciiTheme="majorHAnsi" w:eastAsiaTheme="majorEastAsia" w:hAnsiTheme="majorHAnsi" w:cstheme="majorBidi"/>
+      <w:rFonts w:ascii="Times New Roman" w:hAnsi="Times New Roman"/>
       <w:b/>
       <w:bCs/>
-      <w:color w:val="4F81BD" w:themeColor="accent1"/>
+      <w:color w:val="000000"/>
       <w:sz w:val="26"/>
       <w:szCs w:val="26"/>
+      <w:lang w:val="az-Latn-AZ"/>
     </w:rPr>
   </w:style>
   <w:style w:type="paragraph" w:styleId="Heading3">
@@ -998,7 +832,7 @@
       <w:outlineLvl w:val="2"/>
     </w:pPr>
     <w:rPr>
-      <w:rFonts w:asciiTheme="majorHAnsi" w:eastAsiaTheme="majorEastAsia" w:hAnsiTheme="majorHAnsi" w:cstheme="majorBidi"/>
+      <w:rFonts/>
       <w:b/>
       <w:bCs/>
       <w:color w:val="4F81BD" w:themeColor="accent1"/>
@@ -1021,7 +855,7 @@
       <w:outlineLvl w:val="3"/>
     </w:pPr>
     <w:rPr>
-      <w:rFonts w:asciiTheme="majorHAnsi" w:eastAsiaTheme="majorEastAsia" w:hAnsiTheme="majorHAnsi" w:cstheme="majorBidi"/>
+      <w:rFonts/>
       <w:b/>
       <w:bCs/>
       <w:i/>
@@ -1046,7 +880,7 @@
       <w:outlineLvl w:val="4"/>
     </w:pPr>
     <w:rPr>
-      <w:rFonts w:asciiTheme="majorHAnsi" w:eastAsiaTheme="majorEastAsia" w:hAnsiTheme="majorHAnsi" w:cstheme="majorBidi"/>
+      <w:rFonts/>
       <w:color w:val="243F60" w:themeColor="accent1" w:themeShade="7F"/>
     </w:rPr>
   </w:style>
@@ -1067,7 +901,7 @@
       <w:outlineLvl w:val="5"/>
     </w:pPr>
     <w:rPr>
-      <w:rFonts w:asciiTheme="majorHAnsi" w:eastAsiaTheme="majorEastAsia" w:hAnsiTheme="majorHAnsi" w:cstheme="majorBidi"/>
+      <w:rFonts/>
       <w:i/>
       <w:iCs/>
       <w:color w:val="243F60" w:themeColor="accent1" w:themeShade="7F"/>
@@ -1090,7 +924,7 @@
       <w:outlineLvl w:val="6"/>
     </w:pPr>
     <w:rPr>
-      <w:rFonts w:asciiTheme="majorHAnsi" w:eastAsiaTheme="majorEastAsia" w:hAnsiTheme="majorHAnsi" w:cstheme="majorBidi"/>
+      <w:rFonts/>
       <w:i/>
       <w:iCs/>
       <w:color w:val="404040" w:themeColor="text1" w:themeTint="BF"/>
@@ -1113,7 +947,7 @@
       <w:outlineLvl w:val="7"/>
     </w:pPr>
     <w:rPr>
-      <w:rFonts w:asciiTheme="majorHAnsi" w:eastAsiaTheme="majorEastAsia" w:hAnsiTheme="majorHAnsi" w:cstheme="majorBidi"/>
+      <w:rFonts/>
       <w:color w:val="4F81BD" w:themeColor="accent1"/>
       <w:sz w:val="20"/>
       <w:szCs w:val="20"/>
@@ -1136,7 +970,7 @@
       <w:outlineLvl w:val="8"/>
     </w:pPr>
     <w:rPr>
-      <w:rFonts w:asciiTheme="majorHAnsi" w:eastAsiaTheme="majorEastAsia" w:hAnsiTheme="majorHAnsi" w:cstheme="majorBidi"/>
+      <w:rFonts/>
       <w:i/>
       <w:iCs/>
       <w:color w:val="404040" w:themeColor="text1" w:themeTint="BF"/>
@@ -1187,7 +1021,7 @@
     <w:uiPriority w:val="9"/>
     <w:rsid w:val="00FC693F"/>
     <w:rPr>
-      <w:rFonts w:asciiTheme="majorHAnsi" w:eastAsiaTheme="majorEastAsia" w:hAnsiTheme="majorHAnsi" w:cstheme="majorBidi"/>
+      <w:rFonts/>
       <w:b/>
       <w:bCs/>
       <w:color w:val="365F91" w:themeColor="accent1" w:themeShade="BF"/>
@@ -1202,7 +1036,7 @@
     <w:uiPriority w:val="9"/>
     <w:rsid w:val="00FC693F"/>
     <w:rPr>
-      <w:rFonts w:asciiTheme="majorHAnsi" w:eastAsiaTheme="majorEastAsia" w:hAnsiTheme="majorHAnsi" w:cstheme="majorBidi"/>
+      <w:rFonts/>
       <w:b/>
       <w:bCs/>
       <w:color w:val="4F81BD" w:themeColor="accent1"/>
@@ -1217,7 +1051,7 @@
     <w:uiPriority w:val="9"/>
     <w:rsid w:val="00FC693F"/>
     <w:rPr>
-      <w:rFonts w:asciiTheme="majorHAnsi" w:eastAsiaTheme="majorEastAsia" w:hAnsiTheme="majorHAnsi" w:cstheme="majorBidi"/>
+      <w:rFonts/>
       <w:b/>
       <w:bCs/>
       <w:color w:val="4F81BD" w:themeColor="accent1"/>
@@ -1232,19 +1066,17 @@
     <w:qFormat/>
     <w:rsid w:val="00FC693F"/>
     <w:pPr>
-      <w:pBdr>
-        <w:bottom w:val="single" w:sz="8" w:space="4" w:color="4F81BD" w:themeColor="accent1"/>
-      </w:pBdr>
-      <w:spacing w:after="300" w:line="240" w:lineRule="auto"/>
+      <w:spacing w:after="120" w:line="259" w:lineRule="auto"/>
       <w:contextualSpacing/>
     </w:pPr>
     <w:rPr>
-      <w:rFonts w:asciiTheme="majorHAnsi" w:eastAsiaTheme="majorEastAsia" w:hAnsiTheme="majorHAnsi" w:cstheme="majorBidi"/>
-      <w:color w:val="17365D" w:themeColor="text2" w:themeShade="BF"/>
+      <w:rFonts w:ascii="Times New Roman" w:hAnsi="Times New Roman"/>
+      <w:color w:val="000000"/>
       <w:spacing w:val="5"/>
       <w:kern w:val="28"/>
-      <w:sz w:val="52"/>
+      <w:sz w:val="40"/>
       <w:szCs w:val="52"/>
+      <w:lang w:val="az-Latn-AZ"/>
     </w:rPr>
   </w:style>
   <w:style w:type="character" w:customStyle="1" w:styleId="TitleChar">
@@ -1254,7 +1086,7 @@
     <w:uiPriority w:val="10"/>
     <w:rsid w:val="00FC693F"/>
     <w:rPr>
-      <w:rFonts w:asciiTheme="majorHAnsi" w:eastAsiaTheme="majorEastAsia" w:hAnsiTheme="majorHAnsi" w:cstheme="majorBidi"/>
+      <w:rFonts/>
       <w:color w:val="17365D" w:themeColor="text2" w:themeShade="BF"/>
       <w:spacing w:val="5"/>
       <w:kern w:val="28"/>
@@ -1276,7 +1108,7 @@
       </w:numPr>
     </w:pPr>
     <w:rPr>
-      <w:rFonts w:asciiTheme="majorHAnsi" w:eastAsiaTheme="majorEastAsia" w:hAnsiTheme="majorHAnsi" w:cstheme="majorBidi"/>
+      <w:rFonts/>
       <w:i/>
       <w:iCs/>
       <w:color w:val="4F81BD" w:themeColor="accent1"/>
@@ -1292,7 +1124,7 @@
     <w:uiPriority w:val="11"/>
     <w:rsid w:val="00FC693F"/>
     <w:rPr>
-      <w:rFonts w:asciiTheme="majorHAnsi" w:eastAsiaTheme="majorEastAsia" w:hAnsiTheme="majorHAnsi" w:cstheme="majorBidi"/>
+      <w:rFonts/>
       <w:i/>
       <w:iCs/>
       <w:color w:val="4F81BD" w:themeColor="accent1"/>
@@ -1417,8 +1249,15 @@
       <w:numPr>
         <w:numId w:val="1"/>
       </w:numPr>
+      <w:spacing w:after="120" w:line="259" w:lineRule="auto"/>
       <w:contextualSpacing/>
     </w:pPr>
+    <w:rPr>
+      <w:rFonts w:ascii="Times New Roman" w:hAnsi="Times New Roman"/>
+      <w:color w:val="000000"/>
+      <w:sz w:val="24"/>
+      <w:lang w:val="az-Latn-AZ"/>
+    </w:rPr>
   </w:style>
   <w:style w:type="paragraph" w:styleId="ListBullet2">
     <w:name w:val="List Bullet 2"/>
@@ -1590,7 +1429,7 @@
     <w:semiHidden/>
     <w:rsid w:val="00FC693F"/>
     <w:rPr>
-      <w:rFonts w:asciiTheme="majorHAnsi" w:eastAsiaTheme="majorEastAsia" w:hAnsiTheme="majorHAnsi" w:cstheme="majorBidi"/>
+      <w:rFonts/>
       <w:b/>
       <w:bCs/>
       <w:i/>
@@ -1606,7 +1445,7 @@
     <w:semiHidden/>
     <w:rsid w:val="00FC693F"/>
     <w:rPr>
-      <w:rFonts w:asciiTheme="majorHAnsi" w:eastAsiaTheme="majorEastAsia" w:hAnsiTheme="majorHAnsi" w:cstheme="majorBidi"/>
+      <w:rFonts/>
       <w:color w:val="243F60" w:themeColor="accent1" w:themeShade="7F"/>
     </w:rPr>
   </w:style>
@@ -1618,7 +1457,7 @@
     <w:semiHidden/>
     <w:rsid w:val="00FC693F"/>
     <w:rPr>
-      <w:rFonts w:asciiTheme="majorHAnsi" w:eastAsiaTheme="majorEastAsia" w:hAnsiTheme="majorHAnsi" w:cstheme="majorBidi"/>
+      <w:rFonts/>
       <w:i/>
       <w:iCs/>
       <w:color w:val="243F60" w:themeColor="accent1" w:themeShade="7F"/>
@@ -1632,7 +1471,7 @@
     <w:semiHidden/>
     <w:rsid w:val="00FC693F"/>
     <w:rPr>
-      <w:rFonts w:asciiTheme="majorHAnsi" w:eastAsiaTheme="majorEastAsia" w:hAnsiTheme="majorHAnsi" w:cstheme="majorBidi"/>
+      <w:rFonts/>
       <w:i/>
       <w:iCs/>
       <w:color w:val="404040" w:themeColor="text1" w:themeTint="BF"/>
@@ -1646,7 +1485,7 @@
     <w:semiHidden/>
     <w:rsid w:val="00FC693F"/>
     <w:rPr>
-      <w:rFonts w:asciiTheme="majorHAnsi" w:eastAsiaTheme="majorEastAsia" w:hAnsiTheme="majorHAnsi" w:cstheme="majorBidi"/>
+      <w:rFonts/>
       <w:color w:val="4F81BD" w:themeColor="accent1"/>
       <w:sz w:val="20"/>
       <w:szCs w:val="20"/>
@@ -1660,7 +1499,7 @@
     <w:semiHidden/>
     <w:rsid w:val="00FC693F"/>
     <w:rPr>
-      <w:rFonts w:asciiTheme="majorHAnsi" w:eastAsiaTheme="majorEastAsia" w:hAnsiTheme="majorHAnsi" w:cstheme="majorBidi"/>
+      <w:rFonts/>
       <w:i/>
       <w:iCs/>
       <w:color w:val="404040" w:themeColor="text1" w:themeTint="BF"/>
@@ -1719,9 +1558,6 @@
     <w:qFormat/>
     <w:rsid w:val="00FC693F"/>
     <w:pPr>
-      <w:pBdr>
-        <w:bottom w:val="single" w:sz="4" w:space="4" w:color="4F81BD" w:themeColor="accent1"/>
-      </w:pBdr>
       <w:spacing w:before="200" w:after="280"/>
       <w:ind w:left="936" w:right="936"/>
     </w:pPr>
@@ -3249,7 +3085,7 @@
         <w:spacing w:before="0" w:after="0" w:line="240" w:lineRule="auto"/>
       </w:pPr>
       <w:rPr>
-        <w:rFonts w:asciiTheme="majorHAnsi" w:eastAsiaTheme="majorEastAsia" w:hAnsiTheme="majorHAnsi" w:cstheme="majorBidi"/>
+        <w:rFonts/>
         <w:b/>
         <w:bCs/>
       </w:rPr>
@@ -3270,7 +3106,7 @@
         <w:spacing w:before="0" w:after="0" w:line="240" w:lineRule="auto"/>
       </w:pPr>
       <w:rPr>
-        <w:rFonts w:asciiTheme="majorHAnsi" w:eastAsiaTheme="majorEastAsia" w:hAnsiTheme="majorHAnsi" w:cstheme="majorBidi"/>
+        <w:rFonts/>
         <w:b/>
         <w:bCs/>
       </w:rPr>
@@ -3288,14 +3124,14 @@
     </w:tblStylePr>
     <w:tblStylePr w:type="firstCol">
       <w:rPr>
-        <w:rFonts w:asciiTheme="majorHAnsi" w:eastAsiaTheme="majorEastAsia" w:hAnsiTheme="majorHAnsi" w:cstheme="majorBidi"/>
+        <w:rFonts/>
         <w:b/>
         <w:bCs/>
       </w:rPr>
     </w:tblStylePr>
     <w:tblStylePr w:type="lastCol">
       <w:rPr>
-        <w:rFonts w:asciiTheme="majorHAnsi" w:eastAsiaTheme="majorEastAsia" w:hAnsiTheme="majorHAnsi" w:cstheme="majorBidi"/>
+        <w:rFonts/>
         <w:b/>
         <w:bCs/>
       </w:rPr>
@@ -3379,7 +3215,7 @@
         <w:spacing w:before="0" w:after="0" w:line="240" w:lineRule="auto"/>
       </w:pPr>
       <w:rPr>
-        <w:rFonts w:asciiTheme="majorHAnsi" w:eastAsiaTheme="majorEastAsia" w:hAnsiTheme="majorHAnsi" w:cstheme="majorBidi"/>
+        <w:rFonts/>
         <w:b/>
         <w:bCs/>
       </w:rPr>
@@ -3400,7 +3236,7 @@
         <w:spacing w:before="0" w:after="0" w:line="240" w:lineRule="auto"/>
       </w:pPr>
       <w:rPr>
-        <w:rFonts w:asciiTheme="majorHAnsi" w:eastAsiaTheme="majorEastAsia" w:hAnsiTheme="majorHAnsi" w:cstheme="majorBidi"/>
+        <w:rFonts/>
         <w:b/>
         <w:bCs/>
       </w:rPr>
@@ -3418,14 +3254,14 @@
     </w:tblStylePr>
     <w:tblStylePr w:type="firstCol">
       <w:rPr>
-        <w:rFonts w:asciiTheme="majorHAnsi" w:eastAsiaTheme="majorEastAsia" w:hAnsiTheme="majorHAnsi" w:cstheme="majorBidi"/>
+        <w:rFonts/>
         <w:b/>
         <w:bCs/>
       </w:rPr>
     </w:tblStylePr>
     <w:tblStylePr w:type="lastCol">
       <w:rPr>
-        <w:rFonts w:asciiTheme="majorHAnsi" w:eastAsiaTheme="majorEastAsia" w:hAnsiTheme="majorHAnsi" w:cstheme="majorBidi"/>
+        <w:rFonts/>
         <w:b/>
         <w:bCs/>
       </w:rPr>
@@ -3509,7 +3345,7 @@
         <w:spacing w:before="0" w:after="0" w:line="240" w:lineRule="auto"/>
       </w:pPr>
       <w:rPr>
-        <w:rFonts w:asciiTheme="majorHAnsi" w:eastAsiaTheme="majorEastAsia" w:hAnsiTheme="majorHAnsi" w:cstheme="majorBidi"/>
+        <w:rFonts/>
         <w:b/>
         <w:bCs/>
       </w:rPr>
@@ -3530,7 +3366,7 @@
         <w:spacing w:before="0" w:after="0" w:line="240" w:lineRule="auto"/>
       </w:pPr>
       <w:rPr>
-        <w:rFonts w:asciiTheme="majorHAnsi" w:eastAsiaTheme="majorEastAsia" w:hAnsiTheme="majorHAnsi" w:cstheme="majorBidi"/>
+        <w:rFonts/>
         <w:b/>
         <w:bCs/>
       </w:rPr>
@@ -3548,14 +3384,14 @@
     </w:tblStylePr>
     <w:tblStylePr w:type="firstCol">
       <w:rPr>
-        <w:rFonts w:asciiTheme="majorHAnsi" w:eastAsiaTheme="majorEastAsia" w:hAnsiTheme="majorHAnsi" w:cstheme="majorBidi"/>
+        <w:rFonts/>
         <w:b/>
         <w:bCs/>
       </w:rPr>
     </w:tblStylePr>
     <w:tblStylePr w:type="lastCol">
       <w:rPr>
-        <w:rFonts w:asciiTheme="majorHAnsi" w:eastAsiaTheme="majorEastAsia" w:hAnsiTheme="majorHAnsi" w:cstheme="majorBidi"/>
+        <w:rFonts/>
         <w:b/>
         <w:bCs/>
       </w:rPr>
@@ -3639,7 +3475,7 @@
         <w:spacing w:before="0" w:after="0" w:line="240" w:lineRule="auto"/>
       </w:pPr>
       <w:rPr>
-        <w:rFonts w:asciiTheme="majorHAnsi" w:eastAsiaTheme="majorEastAsia" w:hAnsiTheme="majorHAnsi" w:cstheme="majorBidi"/>
+        <w:rFonts/>
         <w:b/>
         <w:bCs/>
       </w:rPr>
@@ -3660,7 +3496,7 @@
         <w:spacing w:before="0" w:after="0" w:line="240" w:lineRule="auto"/>
       </w:pPr>
       <w:rPr>
-        <w:rFonts w:asciiTheme="majorHAnsi" w:eastAsiaTheme="majorEastAsia" w:hAnsiTheme="majorHAnsi" w:cstheme="majorBidi"/>
+        <w:rFonts/>
         <w:b/>
         <w:bCs/>
       </w:rPr>
@@ -3678,14 +3514,14 @@
     </w:tblStylePr>
     <w:tblStylePr w:type="firstCol">
       <w:rPr>
-        <w:rFonts w:asciiTheme="majorHAnsi" w:eastAsiaTheme="majorEastAsia" w:hAnsiTheme="majorHAnsi" w:cstheme="majorBidi"/>
+        <w:rFonts/>
         <w:b/>
         <w:bCs/>
       </w:rPr>
     </w:tblStylePr>
     <w:tblStylePr w:type="lastCol">
       <w:rPr>
-        <w:rFonts w:asciiTheme="majorHAnsi" w:eastAsiaTheme="majorEastAsia" w:hAnsiTheme="majorHAnsi" w:cstheme="majorBidi"/>
+        <w:rFonts/>
         <w:b/>
         <w:bCs/>
       </w:rPr>
@@ -3769,7 +3605,7 @@
         <w:spacing w:before="0" w:after="0" w:line="240" w:lineRule="auto"/>
       </w:pPr>
       <w:rPr>
-        <w:rFonts w:asciiTheme="majorHAnsi" w:eastAsiaTheme="majorEastAsia" w:hAnsiTheme="majorHAnsi" w:cstheme="majorBidi"/>
+        <w:rFonts/>
         <w:b/>
         <w:bCs/>
       </w:rPr>
@@ -3790,7 +3626,7 @@
         <w:spacing w:before="0" w:after="0" w:line="240" w:lineRule="auto"/>
       </w:pPr>
       <w:rPr>
-        <w:rFonts w:asciiTheme="majorHAnsi" w:eastAsiaTheme="majorEastAsia" w:hAnsiTheme="majorHAnsi" w:cstheme="majorBidi"/>
+        <w:rFonts/>
         <w:b/>
         <w:bCs/>
       </w:rPr>
@@ -3808,14 +3644,14 @@
     </w:tblStylePr>
     <w:tblStylePr w:type="firstCol">
       <w:rPr>
-        <w:rFonts w:asciiTheme="majorHAnsi" w:eastAsiaTheme="majorEastAsia" w:hAnsiTheme="majorHAnsi" w:cstheme="majorBidi"/>
+        <w:rFonts/>
         <w:b/>
         <w:bCs/>
       </w:rPr>
     </w:tblStylePr>
     <w:tblStylePr w:type="lastCol">
       <w:rPr>
-        <w:rFonts w:asciiTheme="majorHAnsi" w:eastAsiaTheme="majorEastAsia" w:hAnsiTheme="majorHAnsi" w:cstheme="majorBidi"/>
+        <w:rFonts/>
         <w:b/>
         <w:bCs/>
       </w:rPr>
@@ -3899,7 +3735,7 @@
         <w:spacing w:before="0" w:after="0" w:line="240" w:lineRule="auto"/>
       </w:pPr>
       <w:rPr>
-        <w:rFonts w:asciiTheme="majorHAnsi" w:eastAsiaTheme="majorEastAsia" w:hAnsiTheme="majorHAnsi" w:cstheme="majorBidi"/>
+        <w:rFonts/>
         <w:b/>
         <w:bCs/>
       </w:rPr>
@@ -3920,7 +3756,7 @@
         <w:spacing w:before="0" w:after="0" w:line="240" w:lineRule="auto"/>
       </w:pPr>
       <w:rPr>
-        <w:rFonts w:asciiTheme="majorHAnsi" w:eastAsiaTheme="majorEastAsia" w:hAnsiTheme="majorHAnsi" w:cstheme="majorBidi"/>
+        <w:rFonts/>
         <w:b/>
         <w:bCs/>
       </w:rPr>
@@ -3938,14 +3774,14 @@
     </w:tblStylePr>
     <w:tblStylePr w:type="firstCol">
       <w:rPr>
-        <w:rFonts w:asciiTheme="majorHAnsi" w:eastAsiaTheme="majorEastAsia" w:hAnsiTheme="majorHAnsi" w:cstheme="majorBidi"/>
+        <w:rFonts/>
         <w:b/>
         <w:bCs/>
       </w:rPr>
     </w:tblStylePr>
     <w:tblStylePr w:type="lastCol">
       <w:rPr>
-        <w:rFonts w:asciiTheme="majorHAnsi" w:eastAsiaTheme="majorEastAsia" w:hAnsiTheme="majorHAnsi" w:cstheme="majorBidi"/>
+        <w:rFonts/>
         <w:b/>
         <w:bCs/>
       </w:rPr>
@@ -4029,7 +3865,7 @@
         <w:spacing w:before="0" w:after="0" w:line="240" w:lineRule="auto"/>
       </w:pPr>
       <w:rPr>
-        <w:rFonts w:asciiTheme="majorHAnsi" w:eastAsiaTheme="majorEastAsia" w:hAnsiTheme="majorHAnsi" w:cstheme="majorBidi"/>
+        <w:rFonts/>
         <w:b/>
         <w:bCs/>
       </w:rPr>
@@ -4050,7 +3886,7 @@
         <w:spacing w:before="0" w:after="0" w:line="240" w:lineRule="auto"/>
       </w:pPr>
       <w:rPr>
-        <w:rFonts w:asciiTheme="majorHAnsi" w:eastAsiaTheme="majorEastAsia" w:hAnsiTheme="majorHAnsi" w:cstheme="majorBidi"/>
+        <w:rFonts/>
         <w:b/>
         <w:bCs/>
       </w:rPr>
@@ -4068,14 +3904,14 @@
     </w:tblStylePr>
     <w:tblStylePr w:type="firstCol">
       <w:rPr>
-        <w:rFonts w:asciiTheme="majorHAnsi" w:eastAsiaTheme="majorEastAsia" w:hAnsiTheme="majorHAnsi" w:cstheme="majorBidi"/>
+        <w:rFonts/>
         <w:b/>
         <w:bCs/>
       </w:rPr>
     </w:tblStylePr>
     <w:tblStylePr w:type="lastCol">
       <w:rPr>
-        <w:rFonts w:asciiTheme="majorHAnsi" w:eastAsiaTheme="majorEastAsia" w:hAnsiTheme="majorHAnsi" w:cstheme="majorBidi"/>
+        <w:rFonts/>
         <w:b/>
         <w:bCs/>
       </w:rPr>
@@ -5940,7 +5776,7 @@
     </w:tblPr>
     <w:tblStylePr w:type="firstRow">
       <w:rPr>
-        <w:rFonts w:asciiTheme="majorHAnsi" w:eastAsiaTheme="majorEastAsia" w:hAnsiTheme="majorHAnsi" w:cstheme="majorBidi"/>
+        <w:rFonts/>
       </w:rPr>
       <w:tblPr/>
       <w:tcPr>
@@ -6024,7 +5860,7 @@
     </w:tblPr>
     <w:tblStylePr w:type="firstRow">
       <w:rPr>
-        <w:rFonts w:asciiTheme="majorHAnsi" w:eastAsiaTheme="majorEastAsia" w:hAnsiTheme="majorHAnsi" w:cstheme="majorBidi"/>
+        <w:rFonts/>
       </w:rPr>
       <w:tblPr/>
       <w:tcPr>
@@ -6108,7 +5944,7 @@
     </w:tblPr>
     <w:tblStylePr w:type="firstRow">
       <w:rPr>
-        <w:rFonts w:asciiTheme="majorHAnsi" w:eastAsiaTheme="majorEastAsia" w:hAnsiTheme="majorHAnsi" w:cstheme="majorBidi"/>
+        <w:rFonts/>
       </w:rPr>
       <w:tblPr/>
       <w:tcPr>
@@ -6192,7 +6028,7 @@
     </w:tblPr>
     <w:tblStylePr w:type="firstRow">
       <w:rPr>
-        <w:rFonts w:asciiTheme="majorHAnsi" w:eastAsiaTheme="majorEastAsia" w:hAnsiTheme="majorHAnsi" w:cstheme="majorBidi"/>
+        <w:rFonts/>
       </w:rPr>
       <w:tblPr/>
       <w:tcPr>
@@ -6276,7 +6112,7 @@
     </w:tblPr>
     <w:tblStylePr w:type="firstRow">
       <w:rPr>
-        <w:rFonts w:asciiTheme="majorHAnsi" w:eastAsiaTheme="majorEastAsia" w:hAnsiTheme="majorHAnsi" w:cstheme="majorBidi"/>
+        <w:rFonts/>
       </w:rPr>
       <w:tblPr/>
       <w:tcPr>
@@ -6360,7 +6196,7 @@
     </w:tblPr>
     <w:tblStylePr w:type="firstRow">
       <w:rPr>
-        <w:rFonts w:asciiTheme="majorHAnsi" w:eastAsiaTheme="majorEastAsia" w:hAnsiTheme="majorHAnsi" w:cstheme="majorBidi"/>
+        <w:rFonts/>
       </w:rPr>
       <w:tblPr/>
       <w:tcPr>
@@ -6444,7 +6280,7 @@
     </w:tblPr>
     <w:tblStylePr w:type="firstRow">
       <w:rPr>
-        <w:rFonts w:asciiTheme="majorHAnsi" w:eastAsiaTheme="majorEastAsia" w:hAnsiTheme="majorHAnsi" w:cstheme="majorBidi"/>
+        <w:rFonts/>
       </w:rPr>
       <w:tblPr/>
       <w:tcPr>
@@ -6509,7 +6345,7 @@
       <w:spacing w:after="0" w:line="240" w:lineRule="auto"/>
     </w:pPr>
     <w:rPr>
-      <w:rFonts w:asciiTheme="majorHAnsi" w:eastAsiaTheme="majorEastAsia" w:hAnsiTheme="majorHAnsi" w:cstheme="majorBidi"/>
+      <w:rFonts/>
       <w:color w:val="000000" w:themeColor="text1"/>
     </w:rPr>
     <w:tblPr>
@@ -6637,7 +6473,7 @@
       <w:spacing w:after="0" w:line="240" w:lineRule="auto"/>
     </w:pPr>
     <w:rPr>
-      <w:rFonts w:asciiTheme="majorHAnsi" w:eastAsiaTheme="majorEastAsia" w:hAnsiTheme="majorHAnsi" w:cstheme="majorBidi"/>
+      <w:rFonts/>
       <w:color w:val="000000" w:themeColor="text1"/>
     </w:rPr>
     <w:tblPr>
@@ -6765,7 +6601,7 @@
       <w:spacing w:after="0" w:line="240" w:lineRule="auto"/>
     </w:pPr>
     <w:rPr>
-      <w:rFonts w:asciiTheme="majorHAnsi" w:eastAsiaTheme="majorEastAsia" w:hAnsiTheme="majorHAnsi" w:cstheme="majorBidi"/>
+      <w:rFonts/>
       <w:color w:val="000000" w:themeColor="text1"/>
     </w:rPr>
     <w:tblPr>
@@ -6893,7 +6729,7 @@
       <w:spacing w:after="0" w:line="240" w:lineRule="auto"/>
     </w:pPr>
     <w:rPr>
-      <w:rFonts w:asciiTheme="majorHAnsi" w:eastAsiaTheme="majorEastAsia" w:hAnsiTheme="majorHAnsi" w:cstheme="majorBidi"/>
+      <w:rFonts/>
       <w:color w:val="000000" w:themeColor="text1"/>
     </w:rPr>
     <w:tblPr>
@@ -7021,7 +6857,7 @@
       <w:spacing w:after="0" w:line="240" w:lineRule="auto"/>
     </w:pPr>
     <w:rPr>
-      <w:rFonts w:asciiTheme="majorHAnsi" w:eastAsiaTheme="majorEastAsia" w:hAnsiTheme="majorHAnsi" w:cstheme="majorBidi"/>
+      <w:rFonts/>
       <w:color w:val="000000" w:themeColor="text1"/>
     </w:rPr>
     <w:tblPr>
@@ -7149,7 +6985,7 @@
       <w:spacing w:after="0" w:line="240" w:lineRule="auto"/>
     </w:pPr>
     <w:rPr>
-      <w:rFonts w:asciiTheme="majorHAnsi" w:eastAsiaTheme="majorEastAsia" w:hAnsiTheme="majorHAnsi" w:cstheme="majorBidi"/>
+      <w:rFonts/>
       <w:color w:val="000000" w:themeColor="text1"/>
     </w:rPr>
     <w:tblPr>
@@ -7277,7 +7113,7 @@
       <w:spacing w:after="0" w:line="240" w:lineRule="auto"/>
     </w:pPr>
     <w:rPr>
-      <w:rFonts w:asciiTheme="majorHAnsi" w:eastAsiaTheme="majorEastAsia" w:hAnsiTheme="majorHAnsi" w:cstheme="majorBidi"/>
+      <w:rFonts/>
       <w:color w:val="000000" w:themeColor="text1"/>
     </w:rPr>
     <w:tblPr>
@@ -7916,7 +7752,7 @@
       <w:spacing w:after="0" w:line="240" w:lineRule="auto"/>
     </w:pPr>
     <w:rPr>
-      <w:rFonts w:asciiTheme="majorHAnsi" w:eastAsiaTheme="majorEastAsia" w:hAnsiTheme="majorHAnsi" w:cstheme="majorBidi"/>
+      <w:rFonts/>
       <w:color w:val="000000" w:themeColor="text1"/>
     </w:rPr>
     <w:tblPr>
@@ -8041,7 +7877,7 @@
       <w:spacing w:after="0" w:line="240" w:lineRule="auto"/>
     </w:pPr>
     <w:rPr>
-      <w:rFonts w:asciiTheme="majorHAnsi" w:eastAsiaTheme="majorEastAsia" w:hAnsiTheme="majorHAnsi" w:cstheme="majorBidi"/>
+      <w:rFonts/>
       <w:color w:val="000000" w:themeColor="text1"/>
     </w:rPr>
     <w:tblPr>
@@ -8166,7 +8002,7 @@
       <w:spacing w:after="0" w:line="240" w:lineRule="auto"/>
     </w:pPr>
     <w:rPr>
-      <w:rFonts w:asciiTheme="majorHAnsi" w:eastAsiaTheme="majorEastAsia" w:hAnsiTheme="majorHAnsi" w:cstheme="majorBidi"/>
+      <w:rFonts/>
       <w:color w:val="000000" w:themeColor="text1"/>
     </w:rPr>
     <w:tblPr>
@@ -8291,7 +8127,7 @@
       <w:spacing w:after="0" w:line="240" w:lineRule="auto"/>
     </w:pPr>
     <w:rPr>
-      <w:rFonts w:asciiTheme="majorHAnsi" w:eastAsiaTheme="majorEastAsia" w:hAnsiTheme="majorHAnsi" w:cstheme="majorBidi"/>
+      <w:rFonts/>
       <w:color w:val="000000" w:themeColor="text1"/>
     </w:rPr>
     <w:tblPr>
@@ -8416,7 +8252,7 @@
       <w:spacing w:after="0" w:line="240" w:lineRule="auto"/>
     </w:pPr>
     <w:rPr>
-      <w:rFonts w:asciiTheme="majorHAnsi" w:eastAsiaTheme="majorEastAsia" w:hAnsiTheme="majorHAnsi" w:cstheme="majorBidi"/>
+      <w:rFonts/>
       <w:color w:val="000000" w:themeColor="text1"/>
     </w:rPr>
     <w:tblPr>
@@ -8541,7 +8377,7 @@
       <w:spacing w:after="0" w:line="240" w:lineRule="auto"/>
     </w:pPr>
     <w:rPr>
-      <w:rFonts w:asciiTheme="majorHAnsi" w:eastAsiaTheme="majorEastAsia" w:hAnsiTheme="majorHAnsi" w:cstheme="majorBidi"/>
+      <w:rFonts/>
       <w:color w:val="000000" w:themeColor="text1"/>
     </w:rPr>
     <w:tblPr>
@@ -8666,7 +8502,7 @@
       <w:spacing w:after="0" w:line="240" w:lineRule="auto"/>
     </w:pPr>
     <w:rPr>
-      <w:rFonts w:asciiTheme="majorHAnsi" w:eastAsiaTheme="majorEastAsia" w:hAnsiTheme="majorHAnsi" w:cstheme="majorBidi"/>
+      <w:rFonts/>
       <w:color w:val="000000" w:themeColor="text1"/>
     </w:rPr>
     <w:tblPr>

</xml_diff>